<commit_message>
Resume layout: a project renders as an experience entry
Owner asked for the selected-project section to use the same entry
format as experience. A project is now literally the same three parts:
an accent-coloured bold name line with its stack in the right column
where dates sit, a bold indented line playing the title's part, then
indented bullets. The subtitle comes from an optional "title" key,
falling back to the existing "line" so old content keeps working.

The certification hint in the model schema now asks for the credential
itself in "school" (Professional Engineer, California) with the number,
discipline and issuing body in "detail"; it had been putting the
jurisdiction in the headline slot.

Both outputs regenerated: the master resume at two pages with nothing
cut, and the Flex draft at one page, 365 words, no style flags and no
guard removals.

Co-Authored-By: Claude Opus 5 <noreply@anthropic.com>
Claude-Session: https://claude.ai/code/session_01WPNZer93LbR2d9qrDdJBQb
</commit_message>
<xml_diff>
--- a/drafts/2026-09-14-flex-product-line-director-dc-power-and-bess.docx
+++ b/drafts/2026-09-14-flex-product-line-director-dc-power-and-bess.docx
@@ -73,7 +73,7 @@
         <w:t xml:space="preserve">BESS: </w:t>
       </w:r>
       <w:r>
-        <w:t>power electronics, power conversion systems (PCS), codes &amp; standards (UL, NFPA), fire safety, testing &amp; certification, lithium-ion system design, BMS, techno-economic analysis</w:t>
+        <w:t>power conversion systems (PCS), power electronics, BMS, fire safety, codes &amp; standards (UL, NFPA), testing &amp; certification, system sizing, techno-economic analysis</w:t>
       </w:r>
     </w:p>
     <w:p>
@@ -97,7 +97,7 @@
         <w:t xml:space="preserve">Product &amp; commercial: </w:t>
       </w:r>
       <w:r>
-        <w:t>product strategy, strategic partnerships (Jabil), market requirements, competitive analysis, contract negotiation, financial modeling, proposal tendering, VOC</w:t>
+        <w:t>product strategy, strategic partnerships (Jabil), market requirements, competitive analysis, contract negotiation, financial modeling</w:t>
       </w:r>
     </w:p>
     <w:p>
@@ -179,7 +179,7 @@
         <w:ind w:left="518"/>
       </w:pPr>
       <w:r>
-        <w:t>Designed the 2.86 MWh pre-integrated container with Jabil, commercializing LG's move from selling racks to integrators to selling a finished product.</w:t>
+        <w:t>Replaced bespoke on-site integration, the market's biggest pain point, with LG's first prefabricated 2.86 MWh ESS container, built with Jabil.</w:t>
       </w:r>
     </w:p>
     <w:p>
@@ -188,7 +188,7 @@
         <w:ind w:left="518"/>
       </w:pPr>
       <w:r>
-        <w:t>Took the 2-hour container through NPI, from requirements to launch, owning vendor coordination, supply chain planning and customer documentation.</w:t>
+        <w:t>Won approval for a 2-hour AC-integrated BESS, against a plan to stay at 4-hour, with a techno-economic business case.</w:t>
       </w:r>
     </w:p>
     <w:p>
@@ -197,7 +197,7 @@
         <w:ind w:left="518"/>
       </w:pPr>
       <w:r>
-        <w:t>Set the container's selling price and chose its inverter configuration with a cell-to-system pricing model that included customers' EPC cost.</w:t>
+        <w:t>Opened the AI data center segment for LG's BESS by defining its ride-through, interconnection and bring-your-own-generation feature set.</w:t>
       </w:r>
     </w:p>
     <w:p>
@@ -206,7 +206,7 @@
         <w:ind w:left="518"/>
       </w:pPr>
       <w:r>
-        <w:t>Achieved UL 9540 listing for the container by setting fire safety requirements before the industry had settled how to prove them.</w:t>
+        <w:t>Achieved UL 9540 listing for the container, setting fire safety requirements and running hazard mitigation analysis and deflagration CFD with fire consultants.</w:t>
       </w:r>
     </w:p>
     <w:p>
@@ -307,6 +307,15 @@
     </w:p>
     <w:p>
       <w:pPr>
+        <w:pStyle w:val="ListBullet"/>
+        <w:ind w:left="518"/>
+      </w:pPr>
+      <w:r>
+        <w:t>Exceeded the department's $2M annual sales goal on commercial and luxury residential projects.</w:t>
+      </w:r>
+    </w:p>
+    <w:p>
+      <w:pPr>
         <w:tabs>
           <w:tab w:pos="10512" w:val="right"/>
         </w:tabs>
@@ -402,10 +411,24 @@
     </w:p>
     <w:p>
       <w:pPr>
+        <w:tabs>
+          <w:tab w:pos="10512" w:val="right"/>
+        </w:tabs>
+        <w:spacing w:before="0"/>
         <w:ind w:left="202"/>
       </w:pPr>
       <w:r>
-        <w:t>Built a five-year business plan for Honda to launch hydrogen fuel cells, electrolyzers and second-life EV batteries into the US C&amp;I market.</w:t>
+        <w:rPr>
+          <w:b/>
+        </w:rPr>
+        <w:t>Wrote a five-year Honda business plan for hydrogen fuel cells and second-life EV batteries in the US C&amp;I market.</w:t>
+      </w:r>
+      <w:r>
+        <w:rPr>
+          <w:i/>
+          <w:color w:val="5B6470"/>
+        </w:rPr>
+        <w:tab/>
       </w:r>
     </w:p>
     <w:p>
@@ -502,7 +525,7 @@
           <w:b/>
           <w:color w:val="1B4965"/>
         </w:rPr>
-        <w:t>California Board for Professional Engineers (NCEES)</w:t>
+        <w:t>California Licensed Professional Engineer</w:t>
       </w:r>
       <w:r>
         <w:rPr>
@@ -518,7 +541,7 @@
         <w:ind w:left="202"/>
       </w:pPr>
       <w:r>
-        <w:t>Licensed Professional Engineer #M38303, Thermal and Fluid Systems</w:t>
+        <w:t>#M38303, Thermal and Fluid Systems, NCEES</w:t>
       </w:r>
     </w:p>
     <w:sectPr>

</xml_diff>